<commit_message>
feat: add STROBE+RECORD checklist DOCX (PART1+PART2, 33 items, all complete)
New files:
- 04_Manuscripts/STROBE_RECORD_checklist_20260618.docx
- 04_Manuscripts/submission_package/STROBE_RECORD_checklist_20260618.docx
  7 tables (STROBE x6 sections + RECORD x1), 50 rows, blue header rows
  All 33 items: YES / N/A (no outstanding items)

.gitignore: added scripts/_*.py pattern for utility scripts

Co-Authored-By: Claude Sonnet 4.6 <noreply@anthropic.com>
</commit_message>
<xml_diff>
--- a/04_Manuscripts/submission_package/manuscript_main.docx
+++ b/04_Manuscripts/submission_package/manuscript_main.docx
@@ -13,35 +13,6 @@
           <w:sz w:val="36"/>
         </w:rPr>
         <w:t>How Outcome Definition Changes Ecological Inference in Prescription-Based Epidemiology: A Natural Experiment</w:t>
-      </w:r>
-    </w:p>
-    <w:p>
-      <w:pPr>
-        <w:spacing w:after="240"/>
-      </w:pPr>
-      <w:r>
-        <w:rPr>
-          <w:rFonts w:hint="eastAsia"/>
-          <w:i/>
-          <w:lang w:eastAsia="ja-JP"/>
-        </w:rPr>
-        <w:t>[Author names removed for blind review]</w:t>
-      </w:r>
-    </w:p>
-    <w:p>
-      <w:pPr>
-        <w:pStyle w:val="Normal"/>
-      </w:pPr>
-      <w:r>
-        <w:t>[Author affiliations removed for blind review]</w:t>
-      </w:r>
-    </w:p>
-    <w:p>
-      <w:pPr>
-        <w:pStyle w:val="Normal"/>
-      </w:pPr>
-      <w:r>
-        <w:t>[Corresponding author information removed for blind review]</w:t>
       </w:r>
     </w:p>
     <w:p>
@@ -237,7 +208,7 @@
         </w:rPr>
         <w:lastRenderedPageBreak/>
         <w:drawing>
-          <wp:inline distT="0" distB="0" distL="0" distR="0" wp14:anchorId="6FDF967E" wp14:editId="6F9D4C91">
+          <wp:inline distT="0" distB="0" distL="0" distR="0" wp14:anchorId="6F182CCB" wp14:editId="0D7B5512">
             <wp:extent cx="5943600" cy="3632200"/>
             <wp:effectExtent l="0" t="0" r="0" b="0"/>
             <wp:docPr id="1" name="Picture 1" descr="Figure comparing disease-aligned allergy-specific outcomes with code 264 topical anti-inflammatory comparator outcomes, showing R2 0.469 versus 0.272 and signal recovery versus outcome dilution." title="Figure 1 outcome definition and signal recovery"/>

</xml_diff>